<commit_message>
Deploying to gh-pages from @ UCD-SERG/lab-manual@011104762fe1a365b4efb5d7d9a6fe821955dc55 🚀
</commit_message>
<xml_diff>
--- a/UCD-SeRG-Lab-Manual.docx
+++ b/UCD-SeRG-Lab-Manual.docx
@@ -28601,7 +28601,7 @@
         <w:t xml:space="preserve"> </w:t>
       </w:r>
       <w:r>
-        <w:t xml:space="preserve">a1283be</w:t>
+        <w:t xml:space="preserve">0111047</w:t>
       </w:r>
     </w:p>
     <w:p>
@@ -28623,7 +28623,7 @@
         <w:t xml:space="preserve"> </w:t>
       </w:r>
       <w:r>
-        <w:t xml:space="preserve">a1283be034f80cf477df30ecbab9422b5b5c4f73</w:t>
+        <w:t xml:space="preserve">011104762fe1a365b4efb5d7d9a6fe821955dc55</w:t>
       </w:r>
     </w:p>
     <w:p>
@@ -28645,7 +28645,7 @@
         <w:t xml:space="preserve"> </w:t>
       </w:r>
       <w:r>
-        <w:t xml:space="preserve">2026-10-12 08:19:23 +0000</w:t>
+        <w:t xml:space="preserve">2026-10-12 08:14:15 +0000</w:t>
       </w:r>
     </w:p>
     <w:p>

</xml_diff>

<commit_message>
Deploying to gh-pages from @ UCD-SERG/lab-manual@a1283be034f80cf477df30ecbab9422b5b5c4f73 🚀
</commit_message>
<xml_diff>
--- a/UCD-SeRG-Lab-Manual.docx
+++ b/UCD-SeRG-Lab-Manual.docx
@@ -28601,7 +28601,7 @@
         <w:t xml:space="preserve"> </w:t>
       </w:r>
       <w:r>
-        <w:t xml:space="preserve">0111047</w:t>
+        <w:t xml:space="preserve">a1283be</w:t>
       </w:r>
     </w:p>
     <w:p>
@@ -28623,7 +28623,7 @@
         <w:t xml:space="preserve"> </w:t>
       </w:r>
       <w:r>
-        <w:t xml:space="preserve">011104762fe1a365b4efb5d7d9a6fe821955dc55</w:t>
+        <w:t xml:space="preserve">a1283be034f80cf477df30ecbab9422b5b5c4f73</w:t>
       </w:r>
     </w:p>
     <w:p>
@@ -28645,7 +28645,7 @@
         <w:t xml:space="preserve"> </w:t>
       </w:r>
       <w:r>
-        <w:t xml:space="preserve">2026-10-12 08:14:15 +0000</w:t>
+        <w:t xml:space="preserve">2026-10-12 08:19:23 +0000</w:t>
       </w:r>
     </w:p>
     <w:p>

</xml_diff>

<commit_message>
Deploying to gh-pages from @ UCD-SERG/lab-manual@35d0639d54e23867aa2ee33a858dfa3fcc630331 🚀
</commit_message>
<xml_diff>
--- a/UCD-SeRG-Lab-Manual.docx
+++ b/UCD-SeRG-Lab-Manual.docx
@@ -15,7 +15,7 @@
         <w:pStyle w:val="Date"/>
       </w:pPr>
       <w:r>
-        <w:t xml:space="preserve">Last updated: 2026-10-12</w:t>
+        <w:t xml:space="preserve">Last updated: 2026-10-14</w:t>
       </w:r>
     </w:p>
     <w:bookmarkStart w:id="14" w:name="welcome-to-ucd-serg"/>
@@ -28601,7 +28601,7 @@
         <w:t xml:space="preserve"> </w:t>
       </w:r>
       <w:r>
-        <w:t xml:space="preserve">a1283be</w:t>
+        <w:t xml:space="preserve">35d0639</w:t>
       </w:r>
     </w:p>
     <w:p>
@@ -28623,7 +28623,7 @@
         <w:t xml:space="preserve"> </w:t>
       </w:r>
       <w:r>
-        <w:t xml:space="preserve">a1283be034f80cf477df30ecbab9422b5b5c4f73</w:t>
+        <w:t xml:space="preserve">35d0639d54e23867aa2ee33a858dfa3fcc630331</w:t>
       </w:r>
     </w:p>
     <w:p>
@@ -28645,7 +28645,7 @@
         <w:t xml:space="preserve"> </w:t>
       </w:r>
       <w:r>
-        <w:t xml:space="preserve">2026-10-12 08:19:23 +0000</w:t>
+        <w:t xml:space="preserve">2026-10-14 08:48:46 +0000</w:t>
       </w:r>
     </w:p>
     <w:p>

</xml_diff>

<commit_message>
Deploying to gh-pages from @ UCD-SERG/lab-manual@8c3ba68c5413d171a65260642541a6316ec96f76 🚀
</commit_message>
<xml_diff>
--- a/UCD-SeRG-Lab-Manual.docx
+++ b/UCD-SeRG-Lab-Manual.docx
@@ -28709,7 +28709,7 @@
         <w:t xml:space="preserve"> </w:t>
       </w:r>
       <w:r>
-        <w:t xml:space="preserve">8cc737f</w:t>
+        <w:t xml:space="preserve">8c3ba68</w:t>
       </w:r>
     </w:p>
     <w:p>
@@ -28731,7 +28731,7 @@
         <w:t xml:space="preserve"> </w:t>
       </w:r>
       <w:r>
-        <w:t xml:space="preserve">8cc737f046f644985e5e34b56a2415a4996f761b</w:t>
+        <w:t xml:space="preserve">8c3ba68c5413d171a65260642541a6316ec96f76</w:t>
       </w:r>
     </w:p>
     <w:p>
@@ -28753,7 +28753,7 @@
         <w:t xml:space="preserve"> </w:t>
       </w:r>
       <w:r>
-        <w:t xml:space="preserve">2026-10-15 06:32:56 +0000</w:t>
+        <w:t xml:space="preserve">2026-10-15 09:02:51 +0000</w:t>
       </w:r>
     </w:p>
     <w:p>

</xml_diff>